<commit_message>
completed the Ball and Socket UML Diagram
</commit_message>
<xml_diff>
--- a/Lab_3/Lab3_PES1UG24AM338_Jira.docx
+++ b/Lab_3/Lab3_PES1UG24AM338_Jira.docx
@@ -675,28 +675,108 @@
     <w:p>
       <w:pPr>
         <w:rPr>
-          <w:sz w:val="32"/>
-          <w:szCs w:val="32"/>
-        </w:rPr>
-      </w:pPr>
-    </w:p>
-    <w:p>
-      <w:pPr>
-        <w:rPr>
-          <w:sz w:val="32"/>
-          <w:szCs w:val="32"/>
-        </w:rPr>
-      </w:pPr>
-    </w:p>
-    <w:p>
-      <w:pPr>
-        <w:rPr>
-          <w:b/>
-          <w:bCs/>
-          <w:sz w:val="32"/>
-          <w:szCs w:val="32"/>
-        </w:rPr>
-      </w:pPr>
+          <w:b/>
+          <w:bCs/>
+          <w:sz w:val="32"/>
+          <w:szCs w:val="32"/>
+        </w:rPr>
+      </w:pPr>
+    </w:p>
+    <w:p/>
+    <w:p>
+      <w:pPr>
+        <w:jc w:val="center"/>
+      </w:pPr>
+      <w:r>
+        <w:rPr>
+          <w:b/>
+          <w:sz w:val="32"/>
+        </w:rPr>
+        <w:t>Completed UML Component Diagram</w:t>
+      </w:r>
+    </w:p>
+    <w:p>
+      <w:r>
+        <w:t>This updated diagram adds explicit provided (ball/lollipop) and required (socket) interfaces for the five existing microservices. API names are shown beside the interfaces.</w:t>
+      </w:r>
+    </w:p>
+    <w:p>
+      <w:pPr>
+        <w:jc w:val="center"/>
+      </w:pPr>
+      <w:r>
+        <w:rPr>
+          <w:noProof/>
+        </w:rPr>
+        <w:drawing>
+          <wp:inline distT="0" distB="0" distL="0" distR="0" wp14:anchorId="298B8678" wp14:editId="68B275CB">
+            <wp:extent cx="6126480" cy="3420757"/>
+            <wp:effectExtent l="0" t="0" r="0" b="0"/>
+            <wp:docPr id="866616915" name="Picture 866616915"/>
+            <wp:cNvGraphicFramePr>
+              <a:graphicFrameLocks xmlns:a="http://schemas.openxmlformats.org/drawingml/2006/main" noChangeAspect="1"/>
+            </wp:cNvGraphicFramePr>
+            <a:graphic xmlns:a="http://schemas.openxmlformats.org/drawingml/2006/main">
+              <a:graphicData uri="http://schemas.openxmlformats.org/drawingml/2006/picture">
+                <pic:pic xmlns:pic="http://schemas.openxmlformats.org/drawingml/2006/picture">
+                  <pic:nvPicPr>
+                    <pic:cNvPr id="0" name="Lab3_completed_component_diagram.png"/>
+                    <pic:cNvPicPr/>
+                  </pic:nvPicPr>
+                  <pic:blipFill>
+                    <a:blip r:embed="rId5"/>
+                    <a:stretch>
+                      <a:fillRect/>
+                    </a:stretch>
+                  </pic:blipFill>
+                  <pic:spPr>
+                    <a:xfrm>
+                      <a:off x="0" y="0"/>
+                      <a:ext cx="6126480" cy="3420757"/>
+                    </a:xfrm>
+                    <a:prstGeom prst="rect">
+                      <a:avLst/>
+                    </a:prstGeom>
+                  </pic:spPr>
+                </pic:pic>
+              </a:graphicData>
+            </a:graphic>
+          </wp:inline>
+        </w:drawing>
+      </w:r>
+    </w:p>
+    <w:p>
+      <w:r>
+        <w:rPr>
+          <w:b/>
+        </w:rPr>
+        <w:t>Interface notation and connections</w:t>
+      </w:r>
+    </w:p>
+    <w:p>
+      <w:r>
+        <w:t>• Provided interface (ball/lollipop): the service offers an API to other components.</w:t>
+      </w:r>
+    </w:p>
+    <w:p>
+      <w:r>
+        <w:t>• Required interface (socket): the service depends on an API offered by another component.</w:t>
+      </w:r>
+    </w:p>
+    <w:p>
+      <w:r>
+        <w:t>• Order Manager requires Payment API, Inventory Check API, Order Status API, and Supplier Order API.</w:t>
+      </w:r>
+    </w:p>
+    <w:p>
+      <w:r>
+        <w:t>• Payment Service provides Payment API; Notification Service provides Order Status API; Supplier Management provides Supplier Order API.</w:t>
+      </w:r>
+    </w:p>
+    <w:p>
+      <w:r>
+        <w:t>• Inventory Management provides Inventory API and supports inventory update interactions with Supplier Management.</w:t>
+      </w:r>
     </w:p>
     <w:sectPr>
       <w:pgSz w:w="11906" w:h="16838"/>
@@ -1311,6 +1391,7 @@
   <w:style w:type="character" w:default="1" w:styleId="DefaultParagraphFont">
     <w:name w:val="Default Paragraph Font"/>
     <w:uiPriority w:val="1"/>
+    <w:semiHidden/>
     <w:unhideWhenUsed/>
   </w:style>
   <w:style w:type="table" w:default="1" w:styleId="TableNormal">

</xml_diff>